<commit_message>
Update finalTEst-eval.docx to Version 2 with new exercises - Topic 7 has 3 can/can't, 3 must/mustn't, 4 pronouns
Co-authored-by: alediaz3112 <14826095+alediaz3112@users.noreply.github.com>
</commit_message>
<xml_diff>
--- a/finalTEst-eval.docx
+++ b/finalTEst-eval.docx
@@ -8,7 +8,7 @@
         <w:jc w:val="center"/>
       </w:pPr>
       <w:r>
-        <w:t>FINALTEST - Revision</w:t>
+        <w:t>FINALTEST - Revision (Version 2)</w:t>
       </w:r>
     </w:p>
     <w:p/>
@@ -114,52 +114,52 @@
     </w:p>
     <w:p>
       <w:r>
-        <w:t>1. This is _______ (Peter) bicycle.</w:t>
-      </w:r>
-    </w:p>
-    <w:p>
-      <w:r>
-        <w:t>2. The _______ (teacher) desk is very big.</w:t>
-      </w:r>
-    </w:p>
-    <w:p>
-      <w:r>
-        <w:t>3. These are my _______ (sister) books.</w:t>
-      </w:r>
-    </w:p>
-    <w:p>
-      <w:r>
-        <w:t>4. Where is _______ (Tom) pencil?</w:t>
-      </w:r>
-    </w:p>
-    <w:p>
-      <w:r>
-        <w:t>5. The _______ (dog) bowl is empty.</w:t>
-      </w:r>
-    </w:p>
-    <w:p>
-      <w:r>
-        <w:t>6. That is _______ (Mary) house.</w:t>
-      </w:r>
-    </w:p>
-    <w:p>
-      <w:r>
-        <w:t>7. The _______ (children) playground is new.</w:t>
-      </w:r>
-    </w:p>
-    <w:p>
-      <w:r>
-        <w:t>8. This is my _______ (friend) phone.</w:t>
-      </w:r>
-    </w:p>
-    <w:p>
-      <w:r>
-        <w:t>9. The _______ (cat) eyes are green.</w:t>
-      </w:r>
-    </w:p>
-    <w:p>
-      <w:r>
-        <w:t>10. Look at _______ (Anna) new dress.</w:t>
+        <w:t>1. This is _______ (Emma) bag.</w:t>
+      </w:r>
+    </w:p>
+    <w:p>
+      <w:r>
+        <w:t>2. The _______ (student) notebook is on the table.</w:t>
+      </w:r>
+    </w:p>
+    <w:p>
+      <w:r>
+        <w:t>3. Where are _______ (James) keys?</w:t>
+      </w:r>
+    </w:p>
+    <w:p>
+      <w:r>
+        <w:t>4. The _______ (baby) toys are colorful.</w:t>
+      </w:r>
+    </w:p>
+    <w:p>
+      <w:r>
+        <w:t>5. That is _______ (Lucy) umbrella.</w:t>
+      </w:r>
+    </w:p>
+    <w:p>
+      <w:r>
+        <w:t>6. The _______ (boys) classroom is upstairs.</w:t>
+      </w:r>
+    </w:p>
+    <w:p>
+      <w:r>
+        <w:t>7. This is my _______ (mother) phone.</w:t>
+      </w:r>
+    </w:p>
+    <w:p>
+      <w:r>
+        <w:t>8. The _______ (bird) nest is in the tree.</w:t>
+      </w:r>
+    </w:p>
+    <w:p>
+      <w:r>
+        <w:t>9. Look at _______ (David) new bicycle.</w:t>
+      </w:r>
+    </w:p>
+    <w:p>
+      <w:r>
+        <w:t>10. The _______ (girls) bags are heavy.</w:t>
       </w:r>
     </w:p>
     <w:p>
@@ -236,52 +236,52 @@
     </w:p>
     <w:p>
       <w:r>
-        <w:t>1. _______ (I) am a student. _______ (I) school is big.</w:t>
-      </w:r>
-    </w:p>
-    <w:p>
-      <w:r>
-        <w:t>2. _______ (She) is my sister. _______ (She) name is Emma.</w:t>
-      </w:r>
-    </w:p>
-    <w:p>
-      <w:r>
-        <w:t>3. _______ (We) live in Spain. _______ (We) house is small.</w:t>
-      </w:r>
-    </w:p>
-    <w:p>
-      <w:r>
-        <w:t>4. _______ (He) likes football. _______ (He) team is Barcelona.</w:t>
-      </w:r>
-    </w:p>
-    <w:p>
-      <w:r>
-        <w:t>5. _______ (They) are my friends. _______ (They) names are John and Kate.</w:t>
-      </w:r>
-    </w:p>
-    <w:p>
-      <w:r>
-        <w:t>6. Circle the correct option: This is (I / my) book.</w:t>
-      </w:r>
-    </w:p>
-    <w:p>
-      <w:r>
-        <w:t>7. Circle the correct option: (She / Her) has a cat.</w:t>
-      </w:r>
-    </w:p>
-    <w:p>
-      <w:r>
-        <w:t>8. Circle the correct option: (We / Our) teacher is kind.</w:t>
-      </w:r>
-    </w:p>
-    <w:p>
-      <w:r>
-        <w:t>9. Circle the correct option: (They / Their) are students.</w:t>
-      </w:r>
-    </w:p>
-    <w:p>
-      <w:r>
-        <w:t>10. Circle the correct option: (He / His) name is Michael.</w:t>
+        <w:t>1. _______ (You) are a good student. _______ (You) grades are excellent.</w:t>
+      </w:r>
+    </w:p>
+    <w:p>
+      <w:r>
+        <w:t>2. _______ (He) plays the guitar. _______ (He) guitar is blue.</w:t>
+      </w:r>
+    </w:p>
+    <w:p>
+      <w:r>
+        <w:t>3. _______ (They) are my neighbors. _______ (They) dog is friendly.</w:t>
+      </w:r>
+    </w:p>
+    <w:p>
+      <w:r>
+        <w:t>4. _______ (I) love reading. _______ (I) favorite book is Harry Potter.</w:t>
+      </w:r>
+    </w:p>
+    <w:p>
+      <w:r>
+        <w:t>5. _______ (She) is a doctor. _______ (She) hospital is near here.</w:t>
+      </w:r>
+    </w:p>
+    <w:p>
+      <w:r>
+        <w:t>6. Circle the correct option: This is (my / I) computer.</w:t>
+      </w:r>
+    </w:p>
+    <w:p>
+      <w:r>
+        <w:t>7. Circle the correct option: (They / Their) live in London.</w:t>
+      </w:r>
+    </w:p>
+    <w:p>
+      <w:r>
+        <w:t>8. Circle the correct option: (Our / We) car is red.</w:t>
+      </w:r>
+    </w:p>
+    <w:p>
+      <w:r>
+        <w:t>9. Circle the correct option: (He / His) brother is tall.</w:t>
+      </w:r>
+    </w:p>
+    <w:p>
+      <w:r>
+        <w:t>10. Circle the correct option: (It / Its) color is green.</w:t>
       </w:r>
     </w:p>
     <w:p>
@@ -356,52 +356,52 @@
     </w:p>
     <w:p>
       <w:r>
-        <w:t>1. _______ a cat in the garden.</w:t>
-      </w:r>
-    </w:p>
-    <w:p>
-      <w:r>
-        <w:t>2. _______ three books on the shelf.</w:t>
-      </w:r>
-    </w:p>
-    <w:p>
-      <w:r>
-        <w:t>3. _______ _______ milk in the fridge. (afirmativa)</w:t>
-      </w:r>
-    </w:p>
-    <w:p>
-      <w:r>
-        <w:t>4. _______ _______ students in the classroom? (pregunta)</w:t>
-      </w:r>
-    </w:p>
-    <w:p>
-      <w:r>
-        <w:t>5. _______ not _______ water in the bottle. (negativa)</w:t>
-      </w:r>
-    </w:p>
-    <w:p>
-      <w:r>
-        <w:t>6. Circle: (There is / There are) a car in the street.</w:t>
-      </w:r>
-    </w:p>
-    <w:p>
-      <w:r>
-        <w:t>7. Circle: (There is / There are) many trees in the park.</w:t>
-      </w:r>
-    </w:p>
-    <w:p>
-      <w:r>
-        <w:t>8. T or F: 'There is three pencils' is correct. _____</w:t>
-      </w:r>
-    </w:p>
-    <w:p>
-      <w:r>
-        <w:t>9. Complete: _______ _______ apples in the basket.</w:t>
-      </w:r>
-    </w:p>
-    <w:p>
-      <w:r>
-        <w:t>10. Complete: Are there _______ cookies?</w:t>
+        <w:t>1. _______ a computer in the office.</w:t>
+      </w:r>
+    </w:p>
+    <w:p>
+      <w:r>
+        <w:t>2. _______ five chairs in the room.</w:t>
+      </w:r>
+    </w:p>
+    <w:p>
+      <w:r>
+        <w:t>3. _______ _______ cookies in the jar. (afirmativa)</w:t>
+      </w:r>
+    </w:p>
+    <w:p>
+      <w:r>
+        <w:t>4. _______ _______ flowers in the garden? (pregunta)</w:t>
+      </w:r>
+    </w:p>
+    <w:p>
+      <w:r>
+        <w:t>5. _______ not _______ sugar in my coffee. (negativa)</w:t>
+      </w:r>
+    </w:p>
+    <w:p>
+      <w:r>
+        <w:t>6. Circle: (There is / There are) a bicycle in the garage.</w:t>
+      </w:r>
+    </w:p>
+    <w:p>
+      <w:r>
+        <w:t>7. Circle: (There is / There are) two dogs in the yard.</w:t>
+      </w:r>
+    </w:p>
+    <w:p>
+      <w:r>
+        <w:t>8. T or F: 'There are a mouse' is correct. _____</w:t>
+      </w:r>
+    </w:p>
+    <w:p>
+      <w:r>
+        <w:t>9. Complete: _______ _______ books on the shelf.</w:t>
+      </w:r>
+    </w:p>
+    <w:p>
+      <w:r>
+        <w:t>10. Complete: Is there _______ milk in the fridge?</w:t>
       </w:r>
     </w:p>
     <w:p>
@@ -481,52 +481,52 @@
     </w:p>
     <w:p>
       <w:r>
-        <w:t>1. I _______ a new bike.</w:t>
-      </w:r>
-    </w:p>
-    <w:p>
-      <w:r>
-        <w:t>2. She _______ long hair.</w:t>
-      </w:r>
-    </w:p>
-    <w:p>
-      <w:r>
-        <w:t>3. They _______ a big house.</w:t>
-      </w:r>
-    </w:p>
-    <w:p>
-      <w:r>
-        <w:t>4. He _______ two brothers.</w:t>
-      </w:r>
-    </w:p>
-    <w:p>
-      <w:r>
-        <w:t>5. We _______ a cat and a dog.</w:t>
-      </w:r>
-    </w:p>
-    <w:p>
-      <w:r>
-        <w:t>6. Circle: My sister (have got / has got) a red dress.</w:t>
-      </w:r>
-    </w:p>
-    <w:p>
-      <w:r>
-        <w:t>7. Circle: (Have you got / Has you got) a pencil?</w:t>
-      </w:r>
-    </w:p>
-    <w:p>
-      <w:r>
-        <w:t>8. Complete (negative): I _______ _______ any money.</w:t>
-      </w:r>
-    </w:p>
-    <w:p>
-      <w:r>
-        <w:t>9. Complete (question): _______ she _______ a computer?</w:t>
-      </w:r>
-    </w:p>
-    <w:p>
-      <w:r>
-        <w:t>10. T or F: 'They has got a car' is correct. _____</w:t>
+        <w:t>1. She _______ a beautiful voice.</w:t>
+      </w:r>
+    </w:p>
+    <w:p>
+      <w:r>
+        <w:t>2. We _______ three pets at home.</w:t>
+      </w:r>
+    </w:p>
+    <w:p>
+      <w:r>
+        <w:t>3. He _______ a new laptop.</w:t>
+      </w:r>
+    </w:p>
+    <w:p>
+      <w:r>
+        <w:t>4. I _______ a red sweater.</w:t>
+      </w:r>
+    </w:p>
+    <w:p>
+      <w:r>
+        <w:t>5. They _______ many friends.</w:t>
+      </w:r>
+    </w:p>
+    <w:p>
+      <w:r>
+        <w:t>6. Circle: The dog (have got / has got) brown eyes.</w:t>
+      </w:r>
+    </w:p>
+    <w:p>
+      <w:r>
+        <w:t>7. Circle: (Have they got / Has they got) a garden?</w:t>
+      </w:r>
+    </w:p>
+    <w:p>
+      <w:r>
+        <w:t>8. Complete (negative): She _______ _______ a sister.</w:t>
+      </w:r>
+    </w:p>
+    <w:p>
+      <w:r>
+        <w:t>9. Complete (question): _______ you _______ a pen?</w:t>
+      </w:r>
+    </w:p>
+    <w:p>
+      <w:r>
+        <w:t>10. T or F: 'We has got a house' is correct. _____</w:t>
       </w:r>
     </w:p>
     <w:p>
@@ -601,52 +601,52 @@
     </w:p>
     <w:p>
       <w:r>
-        <w:t>1. She _______ (like) chocolate.</w:t>
-      </w:r>
-    </w:p>
-    <w:p>
-      <w:r>
-        <w:t>2. They _______ (play) football every Saturday.</w:t>
-      </w:r>
-    </w:p>
-    <w:p>
-      <w:r>
-        <w:t>3. He _______ (not/watch) TV in the morning.</w:t>
-      </w:r>
-    </w:p>
-    <w:p>
-      <w:r>
-        <w:t>4. I _______ (go) to school by bus.</w:t>
-      </w:r>
-    </w:p>
-    <w:p>
-      <w:r>
-        <w:t>5. We _______ (not/live) in a big city.</w:t>
-      </w:r>
-    </w:p>
-    <w:p>
-      <w:r>
-        <w:t>6. Circle: My brother (study / studies) English.</w:t>
-      </w:r>
-    </w:p>
-    <w:p>
-      <w:r>
-        <w:t>7. Circle: I (don't / doesn't) like pizza.</w:t>
-      </w:r>
-    </w:p>
-    <w:p>
-      <w:r>
-        <w:t>8. Complete (negative): She _______ _______ (eat) meat.</w:t>
-      </w:r>
-    </w:p>
-    <w:p>
-      <w:r>
-        <w:t>9. T or F: 'He don't like cats' is correct. _____</w:t>
-      </w:r>
-    </w:p>
-    <w:p>
-      <w:r>
-        <w:t>10. Complete: My parents _______ (work) in a hospital.</w:t>
+        <w:t>1. My cat _______ (sleep) all day.</w:t>
+      </w:r>
+    </w:p>
+    <w:p>
+      <w:r>
+        <w:t>2. We _______ (visit) our grandparents on weekends.</w:t>
+      </w:r>
+    </w:p>
+    <w:p>
+      <w:r>
+        <w:t>3. She _______ (not/drink) coffee.</w:t>
+      </w:r>
+    </w:p>
+    <w:p>
+      <w:r>
+        <w:t>4. They _______ (swim) in the pool every summer.</w:t>
+      </w:r>
+    </w:p>
+    <w:p>
+      <w:r>
+        <w:t>5. He _______ (not/speak) French.</w:t>
+      </w:r>
+    </w:p>
+    <w:p>
+      <w:r>
+        <w:t>6. Circle: The sun (rise / rises) in the east.</w:t>
+      </w:r>
+    </w:p>
+    <w:p>
+      <w:r>
+        <w:t>7. Circle: I (don't / doesn't) eat fish.</w:t>
+      </w:r>
+    </w:p>
+    <w:p>
+      <w:r>
+        <w:t>8. Complete (negative): My brother _______ _______ (play) tennis.</w:t>
+      </w:r>
+    </w:p>
+    <w:p>
+      <w:r>
+        <w:t>9. T or F: 'She don't like vegetables' is correct. _____</w:t>
+      </w:r>
+    </w:p>
+    <w:p>
+      <w:r>
+        <w:t>10. Complete: Birds _______ (fly) in the sky.</w:t>
       </w:r>
     </w:p>
     <w:p>
@@ -726,52 +726,52 @@
     </w:p>
     <w:p>
       <w:r>
-        <w:t>1. I _______ (always) go to bed at 10 pm.</w:t>
-      </w:r>
-    </w:p>
-    <w:p>
-      <w:r>
-        <w:t>2. She _______ (never) eats breakfast.</w:t>
-      </w:r>
-    </w:p>
-    <w:p>
-      <w:r>
-        <w:t>3. They _______ (usually) play football on Sundays.</w:t>
-      </w:r>
-    </w:p>
-    <w:p>
-      <w:r>
-        <w:t>4. We _______ (sometimes) watch TV in the evening.</w:t>
-      </w:r>
-    </w:p>
-    <w:p>
-      <w:r>
-        <w:t>5. He _______ (often) visits his grandparents.</w:t>
-      </w:r>
-    </w:p>
-    <w:p>
-      <w:r>
-        <w:t>6. Circle the correct position: She (is always / always is) happy.</w:t>
-      </w:r>
-    </w:p>
-    <w:p>
-      <w:r>
-        <w:t>7. Circle: I (never go / go never) to the cinema.</w:t>
-      </w:r>
-    </w:p>
-    <w:p>
-      <w:r>
-        <w:t>8. Put the words in order: often / I / books / read → _________________</w:t>
-      </w:r>
-    </w:p>
-    <w:p>
-      <w:r>
-        <w:t>9. Put the words in order: never / late / is / He → _________________</w:t>
-      </w:r>
-    </w:p>
-    <w:p>
-      <w:r>
-        <w:t>10. T or F: 'They are sometimes tired' is correct. _____</w:t>
+        <w:t>1. My sister _______ (always) helps me with homework.</w:t>
+      </w:r>
+    </w:p>
+    <w:p>
+      <w:r>
+        <w:t>2. We _______ (never) arrive late to class.</w:t>
+      </w:r>
+    </w:p>
+    <w:p>
+      <w:r>
+        <w:t>3. He _______ (usually) drinks milk for breakfast.</w:t>
+      </w:r>
+    </w:p>
+    <w:p>
+      <w:r>
+        <w:t>4. They _______ (sometimes) go to the beach.</w:t>
+      </w:r>
+    </w:p>
+    <w:p>
+      <w:r>
+        <w:t>5. I _______ (often) read before sleeping.</w:t>
+      </w:r>
+    </w:p>
+    <w:p>
+      <w:r>
+        <w:t>6. Circle the correct position: The teacher (is usually / usually is) kind.</w:t>
+      </w:r>
+    </w:p>
+    <w:p>
+      <w:r>
+        <w:t>7. Circle: We (never eat / eat never) fast food.</w:t>
+      </w:r>
+    </w:p>
+    <w:p>
+      <w:r>
+        <w:t>8. Put the words in order: sometimes / she / TV / watches → _________________</w:t>
+      </w:r>
+    </w:p>
+    <w:p>
+      <w:r>
+        <w:t>9. Put the words in order: always / are / They / happy → _________________</w:t>
+      </w:r>
+    </w:p>
+    <w:p>
+      <w:r>
+        <w:t>10. T or F: 'He often is hungry' is correct. _____</w:t>
       </w:r>
     </w:p>
     <w:p>
@@ -843,52 +843,52 @@
     </w:p>
     <w:p>
       <w:r>
-        <w:t>1. _______ (Open) the window, please.</w:t>
-      </w:r>
-    </w:p>
-    <w:p>
-      <w:r>
-        <w:t>2. _______ (Not/run) in the classroom.</w:t>
-      </w:r>
-    </w:p>
-    <w:p>
-      <w:r>
-        <w:t>3. You _______ (must) do your homework.</w:t>
-      </w:r>
-    </w:p>
-    <w:p>
-      <w:r>
-        <w:t>4. You _______ (mustn't) use your phone in class.</w:t>
-      </w:r>
-    </w:p>
-    <w:p>
-      <w:r>
-        <w:t>5. I _______ (can) speak English and Spanish.</w:t>
-      </w:r>
-    </w:p>
-    <w:p>
-      <w:r>
-        <w:t>6. Circle: (Listen / Don't listen) to your teacher.</w:t>
-      </w:r>
-    </w:p>
-    <w:p>
-      <w:r>
-        <w:t>7. Circle: You (must / can) wear a uniform at school. (obligación)</w:t>
-      </w:r>
-    </w:p>
-    <w:p>
-      <w:r>
-        <w:t>8. Complete with object pronoun: Give the book to _______ (I).</w:t>
-      </w:r>
-    </w:p>
-    <w:p>
-      <w:r>
-        <w:t>9. Complete with object pronoun: I like _______ (she) very much.</w:t>
-      </w:r>
-    </w:p>
-    <w:p>
-      <w:r>
-        <w:t>10. T or F: 'You can't to go' is correct. _____</w:t>
+        <w:t>1. (can/can't) She _______ play the piano very well.</w:t>
+      </w:r>
+    </w:p>
+    <w:p>
+      <w:r>
+        <w:t>2. (can/can't) I _______ speak Chinese. (negativo)</w:t>
+      </w:r>
+    </w:p>
+    <w:p>
+      <w:r>
+        <w:t>3. (can/can't) Circle: They (can / can't) swim. They go to the pool every week. (afirmativo)</w:t>
+      </w:r>
+    </w:p>
+    <w:p>
+      <w:r>
+        <w:t>4. (must/mustn't) You _______ be quiet in the library.</w:t>
+      </w:r>
+    </w:p>
+    <w:p>
+      <w:r>
+        <w:t>5. (must/mustn't) We _______ forget our homework.</w:t>
+      </w:r>
+    </w:p>
+    <w:p>
+      <w:r>
+        <w:t>6. (must/mustn't) Circle: Students (must / mustn't) arrive on time. (obligación)</w:t>
+      </w:r>
+    </w:p>
+    <w:p>
+      <w:r>
+        <w:t>7. (pronouns) Call _______ (I) tomorrow, please.</w:t>
+      </w:r>
+    </w:p>
+    <w:p>
+      <w:r>
+        <w:t>8. (pronouns) I want to see _______ (they) at the party.</w:t>
+      </w:r>
+    </w:p>
+    <w:p>
+      <w:r>
+        <w:t>9. (pronouns) Can you help _______ (we) with this exercise?</w:t>
+      </w:r>
+    </w:p>
+    <w:p>
+      <w:r>
+        <w:t>10. (pronouns) She loves _______ (he) very much.</w:t>
       </w:r>
     </w:p>
     <w:p>
@@ -961,52 +961,52 @@
     </w:p>
     <w:p>
       <w:r>
-        <w:t>1. I _______ (watch) TV right now.</w:t>
-      </w:r>
-    </w:p>
-    <w:p>
-      <w:r>
-        <w:t>2. She _______ (read) a book at the moment.</w:t>
-      </w:r>
-    </w:p>
-    <w:p>
-      <w:r>
-        <w:t>3. They _______ (play) football in the park.</w:t>
-      </w:r>
-    </w:p>
-    <w:p>
-      <w:r>
-        <w:t>4. He _______ (not/sleep) now.</w:t>
-      </w:r>
-    </w:p>
-    <w:p>
-      <w:r>
-        <w:t>5. We _______ (have) lunch at the moment.</w:t>
-      </w:r>
-    </w:p>
-    <w:p>
-      <w:r>
-        <w:t>6. Circle (countable/uncountable): I want (a / some) water.</w:t>
-      </w:r>
-    </w:p>
-    <w:p>
-      <w:r>
-        <w:t>7. Circle (countable/uncountable): There is (a / some) apple on the table.</w:t>
-      </w:r>
-    </w:p>
-    <w:p>
-      <w:r>
-        <w:t>8. Complete: Are there _______ (some/any) oranges?</w:t>
-      </w:r>
-    </w:p>
-    <w:p>
-      <w:r>
-        <w:t>9. T or F: 'She is cook dinner' is correct. _____</w:t>
-      </w:r>
-    </w:p>
-    <w:p>
-      <w:r>
-        <w:t>10. Complete: We don't have _______ (some/any) rice.</w:t>
+        <w:t>1. She _______ (study) for her exam now.</w:t>
+      </w:r>
+    </w:p>
+    <w:p>
+      <w:r>
+        <w:t>2. We _______ (make) a cake at the moment.</w:t>
+      </w:r>
+    </w:p>
+    <w:p>
+      <w:r>
+        <w:t>3. They _______ (not/listen) to music right now.</w:t>
+      </w:r>
+    </w:p>
+    <w:p>
+      <w:r>
+        <w:t>4. I _______ (write) an email to my friend.</w:t>
+      </w:r>
+    </w:p>
+    <w:p>
+      <w:r>
+        <w:t>5. He _______ (swim) in the pool right now.</w:t>
+      </w:r>
+    </w:p>
+    <w:p>
+      <w:r>
+        <w:t>6. Circle (countable/uncountable): I need (a / some) bread.</w:t>
+      </w:r>
+    </w:p>
+    <w:p>
+      <w:r>
+        <w:t>7. Circle (countable/uncountable): There are (a / some) oranges on the table.</w:t>
+      </w:r>
+    </w:p>
+    <w:p>
+      <w:r>
+        <w:t>8. Complete: Is there _______ (some/any) cheese?</w:t>
+      </w:r>
+    </w:p>
+    <w:p>
+      <w:r>
+        <w:t>9. T or F: 'They are dance now' is correct. _____</w:t>
+      </w:r>
+    </w:p>
+    <w:p>
+      <w:r>
+        <w:t>10. Complete: We don't need _______ (some/any) eggs.</w:t>
       </w:r>
     </w:p>
     <w:p>
@@ -1087,52 +1087,52 @@
     </w:p>
     <w:p>
       <w:r>
-        <w:t>1. I _______ (be) at school yesterday.</w:t>
-      </w:r>
-    </w:p>
-    <w:p>
-      <w:r>
-        <w:t>2. She _______ (be) very happy last week.</w:t>
-      </w:r>
-    </w:p>
-    <w:p>
-      <w:r>
-        <w:t>3. They _______ (be) in the park on Sunday.</w:t>
-      </w:r>
-    </w:p>
-    <w:p>
-      <w:r>
-        <w:t>4. There _______ (be) a dog in the garden. (singular)</w:t>
-      </w:r>
-    </w:p>
-    <w:p>
-      <w:r>
-        <w:t>5. There _______ (be) many cars in the street. (plural)</w:t>
-      </w:r>
-    </w:p>
-    <w:p>
-      <w:r>
-        <w:t>6. We _______ (play) football yesterday.</w:t>
-      </w:r>
-    </w:p>
-    <w:p>
-      <w:r>
-        <w:t>7. He _______ (walk) to school this morning.</w:t>
-      </w:r>
-    </w:p>
-    <w:p>
-      <w:r>
-        <w:t>8. Circle: I (was / were) at home.</w:t>
-      </w:r>
-    </w:p>
-    <w:p>
-      <w:r>
-        <w:t>9. Circle: There (was / were) three cats.</w:t>
-      </w:r>
-    </w:p>
-    <w:p>
-      <w:r>
-        <w:t>10. T or F: 'She play tennis yesterday' is correct. _____</w:t>
+        <w:t>1. We _______ (be) at the museum last Saturday.</w:t>
+      </w:r>
+    </w:p>
+    <w:p>
+      <w:r>
+        <w:t>2. He _______ (be) tired after the game.</w:t>
+      </w:r>
+    </w:p>
+    <w:p>
+      <w:r>
+        <w:t>3. You _______ (be) right about the answer.</w:t>
+      </w:r>
+    </w:p>
+    <w:p>
+      <w:r>
+        <w:t>4. There _______ (be) a butterfly in the garden. (singular)</w:t>
+      </w:r>
+    </w:p>
+    <w:p>
+      <w:r>
+        <w:t>5. There _______ (be) many students at the concert. (plural)</w:t>
+      </w:r>
+    </w:p>
+    <w:p>
+      <w:r>
+        <w:t>6. I _______ (watch) a movie last night.</w:t>
+      </w:r>
+    </w:p>
+    <w:p>
+      <w:r>
+        <w:t>7. They _______ (visit) their aunt yesterday.</w:t>
+      </w:r>
+    </w:p>
+    <w:p>
+      <w:r>
+        <w:t>8. Circle: She (was / were) happy.</w:t>
+      </w:r>
+    </w:p>
+    <w:p>
+      <w:r>
+        <w:t>9. Circle: There (was / were) five books on the desk.</w:t>
+      </w:r>
+    </w:p>
+    <w:p>
+      <w:r>
+        <w:t>10. T or F: 'He walk to school yesterday' is correct. _____</w:t>
       </w:r>
     </w:p>
     <w:p>
@@ -1158,52 +1158,52 @@
     </w:p>
     <w:p>
       <w:r>
-        <w:t>1. Peter's</w:t>
-      </w:r>
-    </w:p>
-    <w:p>
-      <w:r>
-        <w:t>2. teacher's</w:t>
-      </w:r>
-    </w:p>
-    <w:p>
-      <w:r>
-        <w:t>3. sister's</w:t>
-      </w:r>
-    </w:p>
-    <w:p>
-      <w:r>
-        <w:t>4. Tom's</w:t>
-      </w:r>
-    </w:p>
-    <w:p>
-      <w:r>
-        <w:t>5. dog's</w:t>
-      </w:r>
-    </w:p>
-    <w:p>
-      <w:r>
-        <w:t>6. Mary's</w:t>
-      </w:r>
-    </w:p>
-    <w:p>
-      <w:r>
-        <w:t>7. children's</w:t>
-      </w:r>
-    </w:p>
-    <w:p>
-      <w:r>
-        <w:t>8. friend's</w:t>
-      </w:r>
-    </w:p>
-    <w:p>
-      <w:r>
-        <w:t>9. cat's</w:t>
-      </w:r>
-    </w:p>
-    <w:p>
-      <w:r>
-        <w:t>10. Anna's</w:t>
+        <w:t>1. Emma's</w:t>
+      </w:r>
+    </w:p>
+    <w:p>
+      <w:r>
+        <w:t>2. student's</w:t>
+      </w:r>
+    </w:p>
+    <w:p>
+      <w:r>
+        <w:t>3. James's / James'</w:t>
+      </w:r>
+    </w:p>
+    <w:p>
+      <w:r>
+        <w:t>4. baby's</w:t>
+      </w:r>
+    </w:p>
+    <w:p>
+      <w:r>
+        <w:t>5. Lucy's</w:t>
+      </w:r>
+    </w:p>
+    <w:p>
+      <w:r>
+        <w:t>6. boys'</w:t>
+      </w:r>
+    </w:p>
+    <w:p>
+      <w:r>
+        <w:t>7. mother's</w:t>
+      </w:r>
+    </w:p>
+    <w:p>
+      <w:r>
+        <w:t>8. bird's</w:t>
+      </w:r>
+    </w:p>
+    <w:p>
+      <w:r>
+        <w:t>9. David's</w:t>
+      </w:r>
+    </w:p>
+    <w:p>
+      <w:r>
+        <w:t>10. girls'</w:t>
       </w:r>
     </w:p>
     <w:p>
@@ -1216,27 +1216,27 @@
     </w:p>
     <w:p>
       <w:r>
-        <w:t>1. I / My</w:t>
-      </w:r>
-    </w:p>
-    <w:p>
-      <w:r>
-        <w:t>2. She / Her</w:t>
-      </w:r>
-    </w:p>
-    <w:p>
-      <w:r>
-        <w:t>3. We / Our</w:t>
-      </w:r>
-    </w:p>
-    <w:p>
-      <w:r>
-        <w:t>4. He / His</w:t>
-      </w:r>
-    </w:p>
-    <w:p>
-      <w:r>
-        <w:t>5. They / Their</w:t>
+        <w:t>1. You / Your</w:t>
+      </w:r>
+    </w:p>
+    <w:p>
+      <w:r>
+        <w:t>2. He / His</w:t>
+      </w:r>
+    </w:p>
+    <w:p>
+      <w:r>
+        <w:t>3. They / Their</w:t>
+      </w:r>
+    </w:p>
+    <w:p>
+      <w:r>
+        <w:t>4. I / My</w:t>
+      </w:r>
+    </w:p>
+    <w:p>
+      <w:r>
+        <w:t>5. She / Her</w:t>
       </w:r>
     </w:p>
     <w:p>
@@ -1246,7 +1246,7 @@
     </w:p>
     <w:p>
       <w:r>
-        <w:t>7. She</w:t>
+        <w:t>7. They</w:t>
       </w:r>
     </w:p>
     <w:p>
@@ -1256,12 +1256,12 @@
     </w:p>
     <w:p>
       <w:r>
-        <w:t>9. They</w:t>
-      </w:r>
-    </w:p>
-    <w:p>
-      <w:r>
-        <w:t>10. His</w:t>
+        <w:t>9. His</w:t>
+      </w:r>
+    </w:p>
+    <w:p>
+      <w:r>
+        <w:t>10. Its</w:t>
       </w:r>
     </w:p>
     <w:p>
@@ -1284,7 +1284,7 @@
     </w:p>
     <w:p>
       <w:r>
-        <w:t>3. There is some</w:t>
+        <w:t>3. There are some</w:t>
       </w:r>
     </w:p>
     <w:p>
@@ -1332,22 +1332,22 @@
     </w:p>
     <w:p>
       <w:r>
-        <w:t>1. have got / 've got</w:t>
-      </w:r>
-    </w:p>
-    <w:p>
-      <w:r>
-        <w:t>2. has got / 's got</w:t>
-      </w:r>
-    </w:p>
-    <w:p>
-      <w:r>
-        <w:t>3. have got / 've got</w:t>
-      </w:r>
-    </w:p>
-    <w:p>
-      <w:r>
-        <w:t>4. has got / 's got</w:t>
+        <w:t>1. has got / 's got</w:t>
+      </w:r>
+    </w:p>
+    <w:p>
+      <w:r>
+        <w:t>2. have got / 've got</w:t>
+      </w:r>
+    </w:p>
+    <w:p>
+      <w:r>
+        <w:t>3. has got / 's got</w:t>
+      </w:r>
+    </w:p>
+    <w:p>
+      <w:r>
+        <w:t>4. have got / 've got</w:t>
       </w:r>
     </w:p>
     <w:p>
@@ -1362,17 +1362,17 @@
     </w:p>
     <w:p>
       <w:r>
-        <w:t>7. Have you got</w:t>
-      </w:r>
-    </w:p>
-    <w:p>
-      <w:r>
-        <w:t>8. haven't got</w:t>
-      </w:r>
-    </w:p>
-    <w:p>
-      <w:r>
-        <w:t>9. Has / got</w:t>
+        <w:t>7. Have they got</w:t>
+      </w:r>
+    </w:p>
+    <w:p>
+      <w:r>
+        <w:t>8. hasn't got</w:t>
+      </w:r>
+    </w:p>
+    <w:p>
+      <w:r>
+        <w:t>9. Have / got</w:t>
       </w:r>
     </w:p>
     <w:p>
@@ -1390,32 +1390,32 @@
     </w:p>
     <w:p>
       <w:r>
-        <w:t>1. likes</w:t>
-      </w:r>
-    </w:p>
-    <w:p>
-      <w:r>
-        <w:t>2. play</w:t>
-      </w:r>
-    </w:p>
-    <w:p>
-      <w:r>
-        <w:t>3. doesn't watch / does not watch</w:t>
-      </w:r>
-    </w:p>
-    <w:p>
-      <w:r>
-        <w:t>4. go</w:t>
-      </w:r>
-    </w:p>
-    <w:p>
-      <w:r>
-        <w:t>5. don't live / do not live</w:t>
-      </w:r>
-    </w:p>
-    <w:p>
-      <w:r>
-        <w:t>6. studies</w:t>
+        <w:t>1. sleeps</w:t>
+      </w:r>
+    </w:p>
+    <w:p>
+      <w:r>
+        <w:t>2. visit</w:t>
+      </w:r>
+    </w:p>
+    <w:p>
+      <w:r>
+        <w:t>3. doesn't drink / does not drink</w:t>
+      </w:r>
+    </w:p>
+    <w:p>
+      <w:r>
+        <w:t>4. swim</w:t>
+      </w:r>
+    </w:p>
+    <w:p>
+      <w:r>
+        <w:t>5. doesn't speak / does not speak</w:t>
+      </w:r>
+    </w:p>
+    <w:p>
+      <w:r>
+        <w:t>6. rises</w:t>
       </w:r>
     </w:p>
     <w:p>
@@ -1425,7 +1425,7 @@
     </w:p>
     <w:p>
       <w:r>
-        <w:t>8. doesn't eat / does not eat</w:t>
+        <w:t>8. doesn't play / does not play</w:t>
       </w:r>
     </w:p>
     <w:p>
@@ -1435,7 +1435,7 @@
     </w:p>
     <w:p>
       <w:r>
-        <w:t>10. work</w:t>
+        <w:t>10. fly</w:t>
       </w:r>
     </w:p>
     <w:p>
@@ -1473,27 +1473,27 @@
     </w:p>
     <w:p>
       <w:r>
-        <w:t>6. is always</w:t>
-      </w:r>
-    </w:p>
-    <w:p>
-      <w:r>
-        <w:t>7. never go</w:t>
-      </w:r>
-    </w:p>
-    <w:p>
-      <w:r>
-        <w:t>8. I often read books</w:t>
-      </w:r>
-    </w:p>
-    <w:p>
-      <w:r>
-        <w:t>9. He is never late</w:t>
-      </w:r>
-    </w:p>
-    <w:p>
-      <w:r>
-        <w:t>10. T (true)</w:t>
+        <w:t>6. is usually</w:t>
+      </w:r>
+    </w:p>
+    <w:p>
+      <w:r>
+        <w:t>7. never eat</w:t>
+      </w:r>
+    </w:p>
+    <w:p>
+      <w:r>
+        <w:t>8. she sometimes watches TV</w:t>
+      </w:r>
+    </w:p>
+    <w:p>
+      <w:r>
+        <w:t>9. They are always happy</w:t>
+      </w:r>
+    </w:p>
+    <w:p>
+      <w:r>
+        <w:t>10. F (false)</w:t>
       </w:r>
     </w:p>
     <w:p>
@@ -1506,52 +1506,52 @@
     </w:p>
     <w:p>
       <w:r>
-        <w:t>1. Open</w:t>
-      </w:r>
-    </w:p>
-    <w:p>
-      <w:r>
-        <w:t>2. Don't run</w:t>
-      </w:r>
-    </w:p>
-    <w:p>
-      <w:r>
-        <w:t>3. must</w:t>
-      </w:r>
-    </w:p>
-    <w:p>
-      <w:r>
-        <w:t>4. mustn't</w:t>
-      </w:r>
-    </w:p>
-    <w:p>
-      <w:r>
-        <w:t>5. can</w:t>
-      </w:r>
-    </w:p>
-    <w:p>
-      <w:r>
-        <w:t>6. Listen</w:t>
-      </w:r>
-    </w:p>
-    <w:p>
-      <w:r>
-        <w:t>7. must</w:t>
-      </w:r>
-    </w:p>
-    <w:p>
-      <w:r>
-        <w:t>8. me</w:t>
-      </w:r>
-    </w:p>
-    <w:p>
-      <w:r>
-        <w:t>9. her</w:t>
-      </w:r>
-    </w:p>
-    <w:p>
-      <w:r>
-        <w:t>10. F (false)</w:t>
+        <w:t>1. can</w:t>
+      </w:r>
+    </w:p>
+    <w:p>
+      <w:r>
+        <w:t>2. can't / cannot</w:t>
+      </w:r>
+    </w:p>
+    <w:p>
+      <w:r>
+        <w:t>3. can</w:t>
+      </w:r>
+    </w:p>
+    <w:p>
+      <w:r>
+        <w:t>4. must</w:t>
+      </w:r>
+    </w:p>
+    <w:p>
+      <w:r>
+        <w:t>5. mustn't / must not</w:t>
+      </w:r>
+    </w:p>
+    <w:p>
+      <w:r>
+        <w:t>6. must</w:t>
+      </w:r>
+    </w:p>
+    <w:p>
+      <w:r>
+        <w:t>7. me</w:t>
+      </w:r>
+    </w:p>
+    <w:p>
+      <w:r>
+        <w:t>8. them</w:t>
+      </w:r>
+    </w:p>
+    <w:p>
+      <w:r>
+        <w:t>9. us</w:t>
+      </w:r>
+    </w:p>
+    <w:p>
+      <w:r>
+        <w:t>10. him</w:t>
       </w:r>
     </w:p>
     <w:p>
@@ -1564,27 +1564,27 @@
     </w:p>
     <w:p>
       <w:r>
-        <w:t>1. am watching / 'm watching</w:t>
-      </w:r>
-    </w:p>
-    <w:p>
-      <w:r>
-        <w:t>2. is reading / 's reading</w:t>
-      </w:r>
-    </w:p>
-    <w:p>
-      <w:r>
-        <w:t>3. are playing / 're playing</w:t>
-      </w:r>
-    </w:p>
-    <w:p>
-      <w:r>
-        <w:t>4. is not sleeping / isn't sleeping</w:t>
-      </w:r>
-    </w:p>
-    <w:p>
-      <w:r>
-        <w:t>5. are having / 're having</w:t>
+        <w:t>1. is studying / 's studying</w:t>
+      </w:r>
+    </w:p>
+    <w:p>
+      <w:r>
+        <w:t>2. are making / 're making</w:t>
+      </w:r>
+    </w:p>
+    <w:p>
+      <w:r>
+        <w:t>3. are not listening / aren't listening</w:t>
+      </w:r>
+    </w:p>
+    <w:p>
+      <w:r>
+        <w:t>4. am writing / 'm writing</w:t>
+      </w:r>
+    </w:p>
+    <w:p>
+      <w:r>
+        <w:t>5. is swimming / 's swimming</w:t>
       </w:r>
     </w:p>
     <w:p>
@@ -1594,7 +1594,7 @@
     </w:p>
     <w:p>
       <w:r>
-        <w:t>7. an (o a si es manzana verde: a green apple)</w:t>
+        <w:t>7. some</w:t>
       </w:r>
     </w:p>
     <w:p>
@@ -1622,7 +1622,7 @@
     </w:p>
     <w:p>
       <w:r>
-        <w:t>1. was</w:t>
+        <w:t>1. were</w:t>
       </w:r>
     </w:p>
     <w:p>
@@ -1647,12 +1647,12 @@
     </w:p>
     <w:p>
       <w:r>
-        <w:t>6. played</w:t>
-      </w:r>
-    </w:p>
-    <w:p>
-      <w:r>
-        <w:t>7. walked</w:t>
+        <w:t>6. watched</w:t>
+      </w:r>
+    </w:p>
+    <w:p>
+      <w:r>
+        <w:t>7. visited</w:t>
       </w:r>
     </w:p>
     <w:p>

</xml_diff>